<commit_message>
docs: add explanatory images to KaggleWriteup.md and remove the deprecated long-form video script.
</commit_message>
<xml_diff>
--- a/docs/KaggleWriteup.docx
+++ b/docs/KaggleWriteup.docx
@@ -59,6 +59,52 @@
     </w:p>
     <w:p>
       <w:pPr>
+        <w:spacing w:after="160" w:before="80"/>
+        <w:jc w:val="center"/>
+      </w:pPr>
+      <w:r>
+        <w:drawing>
+          <wp:inline distT="0" distB="0" distL="0" distR="0">
+            <wp:extent cx="5905500" cy="3324225"/>
+            <wp:effectExtent t="0" r="0" b="0" l="0"/>
+            <wp:docPr id="1" name="cover.png" descr="cover.png" title="cover.png"/>
+            <wp:cNvGraphicFramePr>
+              <a:graphicFrameLocks xmlns:a="http://schemas.openxmlformats.org/drawingml/2006/main" noChangeAspect="1"/>
+            </wp:cNvGraphicFramePr>
+            <a:graphic xmlns:a="http://schemas.openxmlformats.org/drawingml/2006/main">
+              <a:graphicData uri="http://schemas.openxmlformats.org/drawingml/2006/picture">
+                <pic:pic xmlns:pic="http://schemas.openxmlformats.org/drawingml/2006/picture">
+                  <pic:nvPicPr>
+                    <pic:cNvPr id="0" name="" descr=""/>
+                    <pic:cNvPicPr>
+                      <a:picLocks noChangeAspect="1" noChangeArrowheads="1"/>
+                    </pic:cNvPicPr>
+                  </pic:nvPicPr>
+                  <pic:blipFill>
+                    <a:blip r:embed="rId8" cstate="none"/>
+                    <a:srcRect/>
+                    <a:stretch>
+                      <a:fillRect/>
+                    </a:stretch>
+                  </pic:blipFill>
+                  <pic:spPr bwMode="auto">
+                    <a:xfrm>
+                      <a:off x="0" y="0"/>
+                      <a:ext cx="5905500" cy="3324225"/>
+                    </a:xfrm>
+                    <a:prstGeom prst="rect">
+                      <a:avLst/>
+                    </a:prstGeom>
+                  </pic:spPr>
+                </pic:pic>
+              </a:graphicData>
+            </a:graphic>
+          </wp:inline>
+        </w:drawing>
+      </w:r>
+    </w:p>
+    <w:p>
+      <w:pPr>
         <w:pStyle w:val="Heading1"/>
       </w:pPr>
       <w:r>
@@ -86,7 +132,17 @@
         <w:spacing w:after="160" w:line="276"/>
       </w:pPr>
       <w:r>
-        <w:t xml:space="preserve">The real problem is not a shortage of opinions. It is a shortage of *structured, diverse, adversarial* feedback delivered quickly and at zero marginal cost. Professional focus groups work because they are structured: participants react independently before hearing each other (preventing anchoring), a moderator surfaces disagreements and pushes on weak points, and final evaluations are collected blind (preventing social-desirability bias). That protocol is what makes qualitative research valuable. The cost and time are just friction that most teams cannot absorb.</w:t>
+        <w:t xml:space="preserve">The real problem is not a shortage of opinions. It is a shortage of </w:t>
+      </w:r>
+      <w:r>
+        <w:rPr>
+          <w:i/>
+          <w:iCs/>
+        </w:rPr>
+        <w:t xml:space="preserve">structured, diverse, adversarial</w:t>
+      </w:r>
+      <w:r>
+        <w:t xml:space="preserve"> feedback delivered quickly and at zero marginal cost. Professional focus groups work because they are structured: participants react independently before hearing each other (preventing anchoring), a moderator surfaces disagreements and pushes on weak points, and final evaluations are collected blind (preventing social-desirability bias). That protocol is what makes qualitative research valuable. The cost and time are just friction that most teams cannot absorb.</w:t>
       </w:r>
     </w:p>
     <w:p>
@@ -111,6 +167,68 @@
       </w:pPr>
       <w:r>
         <w:t xml:space="preserve">The Synthetic Market Intelligence Platform is a multi-agent AI system that simulates a structured research panel. You submit any topic — a product concept, a pitch, a strategy, a feature idea — select up to five AI personas, and watch them debate it in real time. When they finish, you receive a synthesized executive report with weighted scores across six dimensions and grounded citations from live web search.</w:t>
+      </w:r>
+    </w:p>
+    <w:p>
+      <w:pPr>
+        <w:spacing w:after="40" w:before="80"/>
+        <w:jc w:val="center"/>
+      </w:pPr>
+      <w:r>
+        <w:drawing>
+          <wp:inline distT="0" distB="0" distL="0" distR="0">
+            <wp:extent cx="5715000" cy="3219450"/>
+            <wp:effectExtent t="0" r="0" b="0" l="0"/>
+            <wp:docPr id="1" name="app-ui.jpg" descr="The three-panel interface — pick a topic and up to five personas, then watch the session run and the synthesis build in real time." title="app-ui.jpg"/>
+            <wp:cNvGraphicFramePr>
+              <a:graphicFrameLocks xmlns:a="http://schemas.openxmlformats.org/drawingml/2006/main" noChangeAspect="1"/>
+            </wp:cNvGraphicFramePr>
+            <a:graphic xmlns:a="http://schemas.openxmlformats.org/drawingml/2006/main">
+              <a:graphicData uri="http://schemas.openxmlformats.org/drawingml/2006/picture">
+                <pic:pic xmlns:pic="http://schemas.openxmlformats.org/drawingml/2006/picture">
+                  <pic:nvPicPr>
+                    <pic:cNvPr id="0" name="" descr=""/>
+                    <pic:cNvPicPr>
+                      <a:picLocks noChangeAspect="1" noChangeArrowheads="1"/>
+                    </pic:cNvPicPr>
+                  </pic:nvPicPr>
+                  <pic:blipFill>
+                    <a:blip r:embed="rId9" cstate="none"/>
+                    <a:srcRect/>
+                    <a:stretch>
+                      <a:fillRect/>
+                    </a:stretch>
+                  </pic:blipFill>
+                  <pic:spPr bwMode="auto">
+                    <a:xfrm>
+                      <a:off x="0" y="0"/>
+                      <a:ext cx="5715000" cy="3219450"/>
+                    </a:xfrm>
+                    <a:prstGeom prst="rect">
+                      <a:avLst/>
+                    </a:prstGeom>
+                  </pic:spPr>
+                </pic:pic>
+              </a:graphicData>
+            </a:graphic>
+          </wp:inline>
+        </w:drawing>
+      </w:r>
+    </w:p>
+    <w:p>
+      <w:pPr>
+        <w:spacing w:after="180"/>
+        <w:jc w:val="center"/>
+      </w:pPr>
+      <w:r>
+        <w:rPr>
+          <w:i/>
+          <w:iCs/>
+          <w:color w:val="666666"/>
+          <w:sz w:val="18"/>
+          <w:szCs w:val="18"/>
+        </w:rPr>
+        <w:t xml:space="preserve">The three-panel interface — pick a topic and up to five personas, then watch the session run and the synthesis build in real time.</w:t>
       </w:r>
     </w:p>
     <w:p>
@@ -564,6 +682,68 @@
     </w:p>
     <w:p>
       <w:pPr>
+        <w:spacing w:after="40" w:before="80"/>
+        <w:jc w:val="center"/>
+      </w:pPr>
+      <w:r>
+        <w:drawing>
+          <wp:inline distT="0" distB="0" distL="0" distR="0">
+            <wp:extent cx="5905500" cy="3324225"/>
+            <wp:effectExtent t="0" r="0" b="0" l="0"/>
+            <wp:docPr id="1" name="architecture.png" descr="The stack end to end. The same ADK panel is also published over MCP (right), reachable from the Agents CLI or Claude Desktop." title="architecture.png"/>
+            <wp:cNvGraphicFramePr>
+              <a:graphicFrameLocks xmlns:a="http://schemas.openxmlformats.org/drawingml/2006/main" noChangeAspect="1"/>
+            </wp:cNvGraphicFramePr>
+            <a:graphic xmlns:a="http://schemas.openxmlformats.org/drawingml/2006/main">
+              <a:graphicData uri="http://schemas.openxmlformats.org/drawingml/2006/picture">
+                <pic:pic xmlns:pic="http://schemas.openxmlformats.org/drawingml/2006/picture">
+                  <pic:nvPicPr>
+                    <pic:cNvPr id="0" name="" descr=""/>
+                    <pic:cNvPicPr>
+                      <a:picLocks noChangeAspect="1" noChangeArrowheads="1"/>
+                    </pic:cNvPicPr>
+                  </pic:nvPicPr>
+                  <pic:blipFill>
+                    <a:blip r:embed="rId10" cstate="none"/>
+                    <a:srcRect/>
+                    <a:stretch>
+                      <a:fillRect/>
+                    </a:stretch>
+                  </pic:blipFill>
+                  <pic:spPr bwMode="auto">
+                    <a:xfrm>
+                      <a:off x="0" y="0"/>
+                      <a:ext cx="5905500" cy="3324225"/>
+                    </a:xfrm>
+                    <a:prstGeom prst="rect">
+                      <a:avLst/>
+                    </a:prstGeom>
+                  </pic:spPr>
+                </pic:pic>
+              </a:graphicData>
+            </a:graphic>
+          </wp:inline>
+        </w:drawing>
+      </w:r>
+    </w:p>
+    <w:p>
+      <w:pPr>
+        <w:spacing w:after="180"/>
+        <w:jc w:val="center"/>
+      </w:pPr>
+      <w:r>
+        <w:rPr>
+          <w:i/>
+          <w:iCs/>
+          <w:color w:val="666666"/>
+          <w:sz w:val="18"/>
+          <w:szCs w:val="18"/>
+        </w:rPr>
+        <w:t xml:space="preserve">The stack end to end. The same ADK panel is also published over MCP (right), reachable from the Agents CLI or Claude Desktop.</w:t>
+      </w:r>
+    </w:p>
+    <w:p>
+      <w:pPr>
         <w:pStyle w:val="Heading2"/>
       </w:pPr>
       <w:r>
@@ -706,6 +886,68 @@
     </w:p>
     <w:p>
       <w:pPr>
+        <w:spacing w:after="40" w:before="80"/>
+        <w:jc w:val="center"/>
+      </w:pPr>
+      <w:r>
+        <w:drawing>
+          <wp:inline distT="0" distB="0" distL="0" distR="0">
+            <wp:extent cx="5715000" cy="3219450"/>
+            <wp:effectExtent t="0" r="0" b="0" l="0"/>
+            <wp:docPr id="1" name="workflow-topology.jpg" descr="Each round fans out to parallel per-persona nodes and reconverges at a JoinNode barrier before the next phase can begin." title="workflow-topology.jpg"/>
+            <wp:cNvGraphicFramePr>
+              <a:graphicFrameLocks xmlns:a="http://schemas.openxmlformats.org/drawingml/2006/main" noChangeAspect="1"/>
+            </wp:cNvGraphicFramePr>
+            <a:graphic xmlns:a="http://schemas.openxmlformats.org/drawingml/2006/main">
+              <a:graphicData uri="http://schemas.openxmlformats.org/drawingml/2006/picture">
+                <pic:pic xmlns:pic="http://schemas.openxmlformats.org/drawingml/2006/picture">
+                  <pic:nvPicPr>
+                    <pic:cNvPr id="0" name="" descr=""/>
+                    <pic:cNvPicPr>
+                      <a:picLocks noChangeAspect="1" noChangeArrowheads="1"/>
+                    </pic:cNvPicPr>
+                  </pic:nvPicPr>
+                  <pic:blipFill>
+                    <a:blip r:embed="rId11" cstate="none"/>
+                    <a:srcRect/>
+                    <a:stretch>
+                      <a:fillRect/>
+                    </a:stretch>
+                  </pic:blipFill>
+                  <pic:spPr bwMode="auto">
+                    <a:xfrm>
+                      <a:off x="0" y="0"/>
+                      <a:ext cx="5715000" cy="3219450"/>
+                    </a:xfrm>
+                    <a:prstGeom prst="rect">
+                      <a:avLst/>
+                    </a:prstGeom>
+                  </pic:spPr>
+                </pic:pic>
+              </a:graphicData>
+            </a:graphic>
+          </wp:inline>
+        </w:drawing>
+      </w:r>
+    </w:p>
+    <w:p>
+      <w:pPr>
+        <w:spacing w:after="180"/>
+        <w:jc w:val="center"/>
+      </w:pPr>
+      <w:r>
+        <w:rPr>
+          <w:i/>
+          <w:iCs/>
+          <w:color w:val="666666"/>
+          <w:sz w:val="18"/>
+          <w:szCs w:val="18"/>
+        </w:rPr>
+        <w:t xml:space="preserve">Each round fans out to parallel per-persona nodes and reconverges at a JoinNode barrier before the next phase can begin.</w:t>
+      </w:r>
+    </w:p>
+    <w:p>
+      <w:pPr>
         <w:spacing w:after="160" w:line="276"/>
       </w:pPr>
       <w:r>
@@ -718,6 +960,68 @@
       </w:pPr>
       <w:r>
         <w:t xml:space="preserve">The build_graph factory accepts a list of AgentPersona TypedDicts and generates node identifiers dynamically (e.g. independent_skeptical_investor, vote_ux_researcher). Adding a new persona requires only a new entry in the persona registry — the graph topology wires itself.</w:t>
+      </w:r>
+    </w:p>
+    <w:p>
+      <w:pPr>
+        <w:spacing w:after="40" w:before="80"/>
+        <w:jc w:val="center"/>
+      </w:pPr>
+      <w:r>
+        <w:drawing>
+          <wp:inline distT="0" distB="0" distL="0" distR="0">
+            <wp:extent cx="5715000" cy="3219450"/>
+            <wp:effectExtent t="0" r="0" b="0" l="0"/>
+            <wp:docPr id="1" name="adk-graph-code.jpg" descr="The runtime fan-out in graph.py: one @node per participant, then a fan-in barrier that collects every response before the workflow advances." title="adk-graph-code.jpg"/>
+            <wp:cNvGraphicFramePr>
+              <a:graphicFrameLocks xmlns:a="http://schemas.openxmlformats.org/drawingml/2006/main" noChangeAspect="1"/>
+            </wp:cNvGraphicFramePr>
+            <a:graphic xmlns:a="http://schemas.openxmlformats.org/drawingml/2006/main">
+              <a:graphicData uri="http://schemas.openxmlformats.org/drawingml/2006/picture">
+                <pic:pic xmlns:pic="http://schemas.openxmlformats.org/drawingml/2006/picture">
+                  <pic:nvPicPr>
+                    <pic:cNvPr id="0" name="" descr=""/>
+                    <pic:cNvPicPr>
+                      <a:picLocks noChangeAspect="1" noChangeArrowheads="1"/>
+                    </pic:cNvPicPr>
+                  </pic:nvPicPr>
+                  <pic:blipFill>
+                    <a:blip r:embed="rId12" cstate="none"/>
+                    <a:srcRect/>
+                    <a:stretch>
+                      <a:fillRect/>
+                    </a:stretch>
+                  </pic:blipFill>
+                  <pic:spPr bwMode="auto">
+                    <a:xfrm>
+                      <a:off x="0" y="0"/>
+                      <a:ext cx="5715000" cy="3219450"/>
+                    </a:xfrm>
+                    <a:prstGeom prst="rect">
+                      <a:avLst/>
+                    </a:prstGeom>
+                  </pic:spPr>
+                </pic:pic>
+              </a:graphicData>
+            </a:graphic>
+          </wp:inline>
+        </w:drawing>
+      </w:r>
+    </w:p>
+    <w:p>
+      <w:pPr>
+        <w:spacing w:after="180"/>
+        <w:jc w:val="center"/>
+      </w:pPr>
+      <w:r>
+        <w:rPr>
+          <w:i/>
+          <w:iCs/>
+          <w:color w:val="666666"/>
+          <w:sz w:val="18"/>
+          <w:szCs w:val="18"/>
+        </w:rPr>
+        <w:t xml:space="preserve">The runtime fan-out in graph.py: one @node per participant, then a fan-in barrier that collects every response before the workflow advances.</w:t>
       </w:r>
     </w:p>
     <w:p>
@@ -887,6 +1191,68 @@
       </w:pPr>
       <w:r>
         <w:t xml:space="preserve">One of the more interesting engineering decisions was building explicit safety controls directly into the workflow as ADK BasePlugin subclasses rather than as prompting constraints.</w:t>
+      </w:r>
+    </w:p>
+    <w:p>
+      <w:pPr>
+        <w:spacing w:after="40" w:before="80"/>
+        <w:jc w:val="center"/>
+      </w:pPr>
+      <w:r>
+        <w:drawing>
+          <wp:inline distT="0" distB="0" distL="0" distR="0">
+            <wp:extent cx="5715000" cy="3219450"/>
+            <wp:effectExtent t="0" r="0" b="0" l="0"/>
+            <wp:docPr id="1" name="security-plugin.jpg" descr="The trust-score logic (simplified for illustration): tool calls are logged per node, over-limit nodes lose trust, and a low score trips the Green Team quarantine flag." title="security-plugin.jpg"/>
+            <wp:cNvGraphicFramePr>
+              <a:graphicFrameLocks xmlns:a="http://schemas.openxmlformats.org/drawingml/2006/main" noChangeAspect="1"/>
+            </wp:cNvGraphicFramePr>
+            <a:graphic xmlns:a="http://schemas.openxmlformats.org/drawingml/2006/main">
+              <a:graphicData uri="http://schemas.openxmlformats.org/drawingml/2006/picture">
+                <pic:pic xmlns:pic="http://schemas.openxmlformats.org/drawingml/2006/picture">
+                  <pic:nvPicPr>
+                    <pic:cNvPr id="0" name="" descr=""/>
+                    <pic:cNvPicPr>
+                      <a:picLocks noChangeAspect="1" noChangeArrowheads="1"/>
+                    </pic:cNvPicPr>
+                  </pic:nvPicPr>
+                  <pic:blipFill>
+                    <a:blip r:embed="rId13" cstate="none"/>
+                    <a:srcRect/>
+                    <a:stretch>
+                      <a:fillRect/>
+                    </a:stretch>
+                  </pic:blipFill>
+                  <pic:spPr bwMode="auto">
+                    <a:xfrm>
+                      <a:off x="0" y="0"/>
+                      <a:ext cx="5715000" cy="3219450"/>
+                    </a:xfrm>
+                    <a:prstGeom prst="rect">
+                      <a:avLst/>
+                    </a:prstGeom>
+                  </pic:spPr>
+                </pic:pic>
+              </a:graphicData>
+            </a:graphic>
+          </wp:inline>
+        </w:drawing>
+      </w:r>
+    </w:p>
+    <w:p>
+      <w:pPr>
+        <w:spacing w:after="180"/>
+        <w:jc w:val="center"/>
+      </w:pPr>
+      <w:r>
+        <w:rPr>
+          <w:i/>
+          <w:iCs/>
+          <w:color w:val="666666"/>
+          <w:sz w:val="18"/>
+          <w:szCs w:val="18"/>
+        </w:rPr>
+        <w:t xml:space="preserve">The trust-score logic (simplified for illustration): tool calls are logged per node, over-limit nodes lose trust, and a low score trips the Green Team quarantine flag.</w:t>
       </w:r>
     </w:p>
     <w:p>

</xml_diff>